<commit_message>
docs(lab3): embed DevOps diagrams
</commit_message>
<xml_diff>
--- a/实验三_DevOps流水线与容器化部署/01_DevOps设计方案.docx
+++ b/实验三_DevOps流水线与容器化部署/01_DevOps设计方案.docx
@@ -1458,6 +1458,66 @@
       </w:tr>
     </w:tbl>
     <w:p/>
+    <w:p>
+      <w:r>
+        <w:br w:type="page"/>
+      </w:r>
+    </w:p>
+    <w:p>
+      <w:pPr>
+        <w:pStyle w:val="Heading1"/>
+      </w:pPr>
+      <w:r>
+        <w:t>图示补充（本次补图）</w:t>
+      </w:r>
+    </w:p>
+    <w:p>
+      <w:pPr>
+        <w:jc w:val="center"/>
+      </w:pPr>
+      <w:r>
+        <w:drawing>
+          <wp:inline xmlns:a="http://schemas.openxmlformats.org/drawingml/2006/main" xmlns:pic="http://schemas.openxmlformats.org/drawingml/2006/picture">
+            <wp:extent cx="5760720" cy="3420427"/>
+            <wp:docPr id="1" name="Picture 1"/>
+            <wp:cNvGraphicFramePr>
+              <a:graphicFrameLocks noChangeAspect="1"/>
+            </wp:cNvGraphicFramePr>
+            <a:graphic>
+              <a:graphicData uri="http://schemas.openxmlformats.org/drawingml/2006/picture">
+                <pic:pic>
+                  <pic:nvPicPr>
+                    <pic:cNvPr id="0" name="lab3_devops_pipeline.png"/>
+                    <pic:cNvPicPr/>
+                  </pic:nvPicPr>
+                  <pic:blipFill>
+                    <a:blip r:embed="rId9"/>
+                    <a:stretch>
+                      <a:fillRect/>
+                    </a:stretch>
+                  </pic:blipFill>
+                  <pic:spPr>
+                    <a:xfrm>
+                      <a:off x="0" y="0"/>
+                      <a:ext cx="5760720" cy="3420427"/>
+                    </a:xfrm>
+                    <a:prstGeom prst="rect"/>
+                  </pic:spPr>
+                </pic:pic>
+              </a:graphicData>
+            </a:graphic>
+          </wp:inline>
+        </w:drawing>
+      </w:r>
+    </w:p>
+    <w:p>
+      <w:pPr>
+        <w:jc w:val="center"/>
+      </w:pPr>
+      <w:r>
+        <w:t>图3-1 DevOps 流水线总览</w:t>
+      </w:r>
+    </w:p>
     <w:sectPr>
       <w:pgSz w:w="12240" w:h="15840"/>
       <w:pgMar w:top="1134" w:right="1247" w:bottom="1134" w:left="1247" w:header="720" w:footer="720" w:gutter="0"/>

</xml_diff>

<commit_message>
docs(lab3): position diagrams in template sections
</commit_message>
<xml_diff>
--- a/实验三_DevOps流水线与容器化部署/01_DevOps设计方案.docx
+++ b/实验三_DevOps流水线与容器化部署/01_DevOps设计方案.docx
@@ -655,6 +655,58 @@
           <w:p>
             <w:r>
               <w:t>流水线服务于两个核心微服务：预约服务负责可用桌位查询、预约创建、健康检查和 Prometheus 指标；会员服务负责会员资料、隐私授权和营销退订。两个服务均在 02_源代码与配置仓库 中实现，并通过 docker-compose、GitHub Actions 和 Helm 统一交付。</w:t>
+            </w:r>
+          </w:p>
+          <w:p>
+            <w:pPr>
+              <w:spacing w:before="0" w:after="0"/>
+            </w:pPr>
+          </w:p>
+          <w:p>
+            <w:pPr>
+              <w:jc w:val="center"/>
+            </w:pPr>
+            <w:r>
+              <w:drawing>
+                <wp:inline xmlns:a="http://schemas.openxmlformats.org/drawingml/2006/main" xmlns:pic="http://schemas.openxmlformats.org/drawingml/2006/picture">
+                  <wp:extent cx="4983480" cy="2958941"/>
+                  <wp:docPr id="1" name="Picture 1"/>
+                  <wp:cNvGraphicFramePr>
+                    <a:graphicFrameLocks noChangeAspect="1"/>
+                  </wp:cNvGraphicFramePr>
+                  <a:graphic>
+                    <a:graphicData uri="http://schemas.openxmlformats.org/drawingml/2006/picture">
+                      <pic:pic>
+                        <pic:nvPicPr>
+                          <pic:cNvPr id="0" name="image.png"/>
+                          <pic:cNvPicPr/>
+                        </pic:nvPicPr>
+                        <pic:blipFill>
+                          <a:blip r:embed="rId9"/>
+                          <a:stretch>
+                            <a:fillRect/>
+                          </a:stretch>
+                        </pic:blipFill>
+                        <pic:spPr>
+                          <a:xfrm>
+                            <a:off x="0" y="0"/>
+                            <a:ext cx="4983480" cy="2958941"/>
+                          </a:xfrm>
+                          <a:prstGeom prst="rect"/>
+                        </pic:spPr>
+                      </pic:pic>
+                    </a:graphicData>
+                  </a:graphic>
+                </wp:inline>
+              </w:drawing>
+            </w:r>
+          </w:p>
+          <w:p>
+            <w:pPr>
+              <w:jc w:val="center"/>
+            </w:pPr>
+            <w:r>
+              <w:t>图3-1 DevOps 流水线总览</w:t>
             </w:r>
           </w:p>
         </w:tc>
@@ -1458,66 +1510,6 @@
       </w:tr>
     </w:tbl>
     <w:p/>
-    <w:p>
-      <w:r>
-        <w:br w:type="page"/>
-      </w:r>
-    </w:p>
-    <w:p>
-      <w:pPr>
-        <w:pStyle w:val="Heading1"/>
-      </w:pPr>
-      <w:r>
-        <w:t>图示补充（本次补图）</w:t>
-      </w:r>
-    </w:p>
-    <w:p>
-      <w:pPr>
-        <w:jc w:val="center"/>
-      </w:pPr>
-      <w:r>
-        <w:drawing>
-          <wp:inline xmlns:a="http://schemas.openxmlformats.org/drawingml/2006/main" xmlns:pic="http://schemas.openxmlformats.org/drawingml/2006/picture">
-            <wp:extent cx="5760720" cy="3420427"/>
-            <wp:docPr id="1" name="Picture 1"/>
-            <wp:cNvGraphicFramePr>
-              <a:graphicFrameLocks noChangeAspect="1"/>
-            </wp:cNvGraphicFramePr>
-            <a:graphic>
-              <a:graphicData uri="http://schemas.openxmlformats.org/drawingml/2006/picture">
-                <pic:pic>
-                  <pic:nvPicPr>
-                    <pic:cNvPr id="0" name="lab3_devops_pipeline.png"/>
-                    <pic:cNvPicPr/>
-                  </pic:nvPicPr>
-                  <pic:blipFill>
-                    <a:blip r:embed="rId9"/>
-                    <a:stretch>
-                      <a:fillRect/>
-                    </a:stretch>
-                  </pic:blipFill>
-                  <pic:spPr>
-                    <a:xfrm>
-                      <a:off x="0" y="0"/>
-                      <a:ext cx="5760720" cy="3420427"/>
-                    </a:xfrm>
-                    <a:prstGeom prst="rect"/>
-                  </pic:spPr>
-                </pic:pic>
-              </a:graphicData>
-            </a:graphic>
-          </wp:inline>
-        </w:drawing>
-      </w:r>
-    </w:p>
-    <w:p>
-      <w:pPr>
-        <w:jc w:val="center"/>
-      </w:pPr>
-      <w:r>
-        <w:t>图3-1 DevOps 流水线总览</w:t>
-      </w:r>
-    </w:p>
     <w:sectPr>
       <w:pgSz w:w="12240" w:h="15840"/>
       <w:pgMar w:top="1134" w:right="1247" w:bottom="1134" w:left="1247" w:header="720" w:footer="720" w:gutter="0"/>

</xml_diff>

<commit_message>
docs(lab3): move pipeline figure to flow section
</commit_message>
<xml_diff>
--- a/实验三_DevOps流水线与容器化部署/01_DevOps设计方案.docx
+++ b/实验三_DevOps流水线与容器化部署/01_DevOps设计方案.docx
@@ -662,53 +662,6 @@
               <w:spacing w:before="0" w:after="0"/>
             </w:pPr>
           </w:p>
-          <w:p>
-            <w:pPr>
-              <w:jc w:val="center"/>
-            </w:pPr>
-            <w:r>
-              <w:drawing>
-                <wp:inline xmlns:a="http://schemas.openxmlformats.org/drawingml/2006/main" xmlns:pic="http://schemas.openxmlformats.org/drawingml/2006/picture">
-                  <wp:extent cx="4983480" cy="2958941"/>
-                  <wp:docPr id="1" name="Picture 1"/>
-                  <wp:cNvGraphicFramePr>
-                    <a:graphicFrameLocks noChangeAspect="1"/>
-                  </wp:cNvGraphicFramePr>
-                  <a:graphic>
-                    <a:graphicData uri="http://schemas.openxmlformats.org/drawingml/2006/picture">
-                      <pic:pic>
-                        <pic:nvPicPr>
-                          <pic:cNvPr id="0" name="image.png"/>
-                          <pic:cNvPicPr/>
-                        </pic:nvPicPr>
-                        <pic:blipFill>
-                          <a:blip r:embed="rId9"/>
-                          <a:stretch>
-                            <a:fillRect/>
-                          </a:stretch>
-                        </pic:blipFill>
-                        <pic:spPr>
-                          <a:xfrm>
-                            <a:off x="0" y="0"/>
-                            <a:ext cx="4983480" cy="2958941"/>
-                          </a:xfrm>
-                          <a:prstGeom prst="rect"/>
-                        </pic:spPr>
-                      </pic:pic>
-                    </a:graphicData>
-                  </a:graphic>
-                </wp:inline>
-              </w:drawing>
-            </w:r>
-          </w:p>
-          <w:p>
-            <w:pPr>
-              <w:jc w:val="center"/>
-            </w:pPr>
-            <w:r>
-              <w:t>图3-1 DevOps 流水线总览</w:t>
-            </w:r>
-          </w:p>
         </w:tc>
       </w:tr>
     </w:tbl>
@@ -1212,6 +1165,53 @@
               <w:t xml:space="preserve">  J -- no --&gt; L[Rollback previous revision]</w:t>
             </w:r>
           </w:p>
+          <w:p>
+            <w:pPr>
+              <w:jc w:val="center"/>
+            </w:pPr>
+            <w:r>
+              <w:drawing>
+                <wp:inline xmlns:a="http://schemas.openxmlformats.org/drawingml/2006/main" xmlns:pic="http://schemas.openxmlformats.org/drawingml/2006/picture">
+                  <wp:extent cx="4983480" cy="2958941"/>
+                  <wp:docPr id="1" name="Picture 1"/>
+                  <wp:cNvGraphicFramePr>
+                    <a:graphicFrameLocks noChangeAspect="1"/>
+                  </wp:cNvGraphicFramePr>
+                  <a:graphic>
+                    <a:graphicData uri="http://schemas.openxmlformats.org/drawingml/2006/picture">
+                      <pic:pic>
+                        <pic:nvPicPr>
+                          <pic:cNvPr id="0" name="image.png"/>
+                          <pic:cNvPicPr/>
+                        </pic:nvPicPr>
+                        <pic:blipFill>
+                          <a:blip r:embed="rId9"/>
+                          <a:stretch>
+                            <a:fillRect/>
+                          </a:stretch>
+                        </pic:blipFill>
+                        <pic:spPr>
+                          <a:xfrm>
+                            <a:off x="0" y="0"/>
+                            <a:ext cx="4983480" cy="2958941"/>
+                          </a:xfrm>
+                          <a:prstGeom prst="rect"/>
+                        </pic:spPr>
+                      </pic:pic>
+                    </a:graphicData>
+                  </a:graphic>
+                </wp:inline>
+              </w:drawing>
+            </w:r>
+          </w:p>
+          <w:p>
+            <w:pPr>
+              <w:jc w:val="center"/>
+            </w:pPr>
+            <w:r>
+              <w:t>图3-1 DevOps 流水线总览</w:t>
+            </w:r>
+          </w:p>
         </w:tc>
       </w:tr>
     </w:tbl>

</xml_diff>

<commit_message>
docs(lab3): fix pipeline and screenshot sections
</commit_message>
<xml_diff>
--- a/实验三_DevOps流水线与容器化部署/01_DevOps设计方案.docx
+++ b/实验三_DevOps流水线与容器化部署/01_DevOps设计方案.docx
@@ -1102,67 +1102,114 @@
           </w:tcPr>
           <w:p>
             <w:r>
+              <w:rPr>
+                <w:b w:val="0"/>
+              </w:rPr>
               <w:t>Mermaid 流程图源代码：</w:t>
             </w:r>
           </w:p>
           <w:p>
             <w:r>
-              <w:t>graph LR</w:t>
+              <w:rPr>
+                <w:b w:val="0"/>
+              </w:rPr>
+              <w:t>flowchart LR</w:t>
             </w:r>
           </w:p>
           <w:p>
             <w:r>
-              <w:t xml:space="preserve">  A[Git Push/PR] --&gt; B[CI: test]</w:t>
+              <w:rPr>
+                <w:b w:val="0"/>
+              </w:rPr>
+              <w:t xml:space="preserve">  A[Git Push / PR] --&gt; B[CI: unit test + lint]</w:t>
             </w:r>
           </w:p>
           <w:p>
             <w:r>
-              <w:t xml:space="preserve">  B --&gt; C[Docker build]</w:t>
+              <w:rPr>
+                <w:b w:val="0"/>
+              </w:rPr>
+              <w:t xml:space="preserve">  B --&gt; C{CI gate passed?}</w:t>
             </w:r>
           </w:p>
           <w:p>
             <w:r>
-              <w:t xml:space="preserve">  C --&gt; D[Trivy scan]</w:t>
+              <w:rPr>
+                <w:b w:val="0"/>
+              </w:rPr>
+              <w:t xml:space="preserve">  C -- no --&gt; R1[Block merge and comment failure]</w:t>
             </w:r>
           </w:p>
           <w:p>
             <w:r>
-              <w:t xml:space="preserve">  D --&gt; E[PR comment metrics]</w:t>
+              <w:rPr>
+                <w:b w:val="0"/>
+              </w:rPr>
+              <w:t xml:space="preserve">  C -- yes --&gt; D[Docker build + Trivy scan]</w:t>
             </w:r>
           </w:p>
           <w:p>
             <w:r>
-              <w:t xml:space="preserve">  E --&gt; F[Merge main]</w:t>
+              <w:rPr>
+                <w:b w:val="0"/>
+              </w:rPr>
+              <w:t xml:space="preserve">  D --&gt; E[Push image tag and SBOM]</w:t>
             </w:r>
           </w:p>
           <w:p>
             <w:r>
-              <w:t xml:space="preserve">  F --&gt; G[CD: helm lint]</w:t>
+              <w:rPr>
+                <w:b w:val="0"/>
+              </w:rPr>
+              <w:t xml:space="preserve">  E --&gt; F[CD: environment approval]</w:t>
             </w:r>
           </w:p>
           <w:p>
             <w:r>
-              <w:t xml:space="preserve">  G --&gt; H[Deploy staging]</w:t>
+              <w:rPr>
+                <w:b w:val="0"/>
+              </w:rPr>
+              <w:t xml:space="preserve">  F --&gt; G[Helm lint / template / upgrade]</w:t>
             </w:r>
           </w:p>
           <w:p>
             <w:r>
-              <w:t xml:space="preserve">  H --&gt; I[Canary 10%]</w:t>
+              <w:rPr>
+                <w:b w:val="0"/>
+              </w:rPr>
+              <w:t xml:space="preserve">  G --&gt; H[Canary 10%]</w:t>
             </w:r>
           </w:p>
           <w:p>
             <w:r>
-              <w:t xml:space="preserve">  I --&gt; J{P95&lt;=350ms &amp;&amp; error&lt;1%}</w:t>
+              <w:rPr>
+                <w:b w:val="0"/>
+              </w:rPr>
+              <w:t xml:space="preserve">  H --&gt; I{P95 within 350ms and error rate under 1%}</w:t>
             </w:r>
           </w:p>
           <w:p>
             <w:r>
-              <w:t xml:space="preserve">  J -- yes --&gt; K[Promote 100%]</w:t>
+              <w:rPr>
+                <w:b w:val="0"/>
+              </w:rPr>
+              <w:t xml:space="preserve">  I -- yes --&gt; J[Promote 100%]</w:t>
             </w:r>
           </w:p>
           <w:p>
             <w:r>
-              <w:t xml:space="preserve">  J -- no --&gt; L[Rollback previous revision]</w:t>
+              <w:rPr>
+                <w:b w:val="0"/>
+              </w:rPr>
+              <w:t xml:space="preserve">  I -- no --&gt; K[Rollback previous revision]</w:t>
+            </w:r>
+          </w:p>
+          <w:p>
+            <w:r>
+              <w:rPr>
+                <w:b w:val="0"/>
+              </w:rPr>
+              <w:t xml:space="preserve">  K --&gt; R2[Open incident and attach metrics]</w:t>
             </w:r>
           </w:p>
           <w:p>
@@ -1172,7 +1219,7 @@
             <w:r>
               <w:drawing>
                 <wp:inline xmlns:a="http://schemas.openxmlformats.org/drawingml/2006/main" xmlns:pic="http://schemas.openxmlformats.org/drawingml/2006/picture">
-                  <wp:extent cx="4983480" cy="2958941"/>
+                  <wp:extent cx="5349240" cy="3122800"/>
                   <wp:docPr id="1" name="Picture 1"/>
                   <wp:cNvGraphicFramePr>
                     <a:graphicFrameLocks noChangeAspect="1"/>
@@ -1185,7 +1232,7 @@
                           <pic:cNvPicPr/>
                         </pic:nvPicPr>
                         <pic:blipFill>
-                          <a:blip r:embed="rId9"/>
+                          <a:blip r:embed="rId11"/>
                           <a:stretch>
                             <a:fillRect/>
                           </a:stretch>
@@ -1193,7 +1240,7 @@
                         <pic:spPr>
                           <a:xfrm>
                             <a:off x="0" y="0"/>
-                            <a:ext cx="4983480" cy="2958941"/>
+                            <a:ext cx="5349240" cy="3122800"/>
                           </a:xfrm>
                           <a:prstGeom prst="rect"/>
                         </pic:spPr>
@@ -1209,7 +1256,7 @@
               <w:jc w:val="center"/>
             </w:pPr>
             <w:r>
-              <w:t>图3-1 DevOps 流水线总览</w:t>
+              <w:t>图3-1 DevOps 流水线总体图</w:t>
             </w:r>
           </w:p>
         </w:tc>

</xml_diff>